<commit_message>
refactor: template report kalibrasi besland
</commit_message>
<xml_diff>
--- a/templates/template_report_kalibrasi_besland.docx
+++ b/templates/template_report_kalibrasi_besland.docx
@@ -426,8 +426,6 @@
               <w:jc w:val="center"/>
               <w:rPr>
                 <w:rFonts w:ascii="Times New Roman" w:eastAsia="Times New Roman" w:hAnsi="Times New Roman" w:cs="Times New Roman"/>
-                <w:b/>
-                <w:bCs/>
                 <w:color w:val="000000"/>
                 <w:sz w:val="24"/>
                 <w:szCs w:val="24"/>
@@ -436,8 +434,6 @@
             <w:r>
               <w:rPr>
                 <w:rFonts w:ascii="Times New Roman" w:eastAsia="Times New Roman" w:hAnsi="Times New Roman" w:cs="Times New Roman"/>
-                <w:b/>
-                <w:bCs/>
                 <w:color w:val="000000"/>
                 <w:sz w:val="24"/>
                 <w:szCs w:val="24"/>
@@ -463,8 +459,6 @@
               <w:jc w:val="center"/>
               <w:rPr>
                 <w:rFonts w:ascii="Times New Roman" w:eastAsia="Times New Roman" w:hAnsi="Times New Roman" w:cs="Times New Roman"/>
-                <w:b/>
-                <w:bCs/>
                 <w:color w:val="000000"/>
                 <w:sz w:val="24"/>
                 <w:szCs w:val="24"/>
@@ -473,8 +467,6 @@
             <w:r>
               <w:rPr>
                 <w:rFonts w:ascii="Times New Roman" w:eastAsia="Times New Roman" w:hAnsi="Times New Roman" w:cs="Times New Roman"/>
-                <w:b/>
-                <w:bCs/>
                 <w:color w:val="000000"/>
                 <w:sz w:val="24"/>
                 <w:szCs w:val="24"/>
@@ -500,8 +492,6 @@
               <w:jc w:val="center"/>
               <w:rPr>
                 <w:rFonts w:ascii="Times New Roman" w:eastAsia="Times New Roman" w:hAnsi="Times New Roman" w:cs="Times New Roman"/>
-                <w:b/>
-                <w:bCs/>
                 <w:color w:val="000000"/>
                 <w:sz w:val="24"/>
                 <w:szCs w:val="24"/>
@@ -510,8 +500,6 @@
             <w:r>
               <w:rPr>
                 <w:rFonts w:ascii="Times New Roman" w:eastAsia="Times New Roman" w:hAnsi="Times New Roman" w:cs="Times New Roman"/>
-                <w:b/>
-                <w:bCs/>
                 <w:color w:val="000000"/>
                 <w:sz w:val="24"/>
                 <w:szCs w:val="24"/>
@@ -537,8 +525,6 @@
               <w:jc w:val="center"/>
               <w:rPr>
                 <w:rFonts w:ascii="Times New Roman" w:eastAsia="Times New Roman" w:hAnsi="Times New Roman" w:cs="Times New Roman"/>
-                <w:b/>
-                <w:bCs/>
                 <w:color w:val="000000"/>
                 <w:sz w:val="24"/>
                 <w:szCs w:val="24"/>
@@ -547,8 +533,6 @@
             <w:r>
               <w:rPr>
                 <w:rFonts w:ascii="Times New Roman" w:eastAsia="Times New Roman" w:hAnsi="Times New Roman" w:cs="Times New Roman"/>
-                <w:b/>
-                <w:bCs/>
                 <w:color w:val="000000"/>
                 <w:sz w:val="24"/>
                 <w:szCs w:val="24"/>
@@ -3558,17 +3542,13 @@
               <w:jc w:val="center"/>
               <w:rPr>
                 <w:rFonts w:ascii="Times New Roman" w:eastAsia="Times New Roman" w:hAnsi="Times New Roman" w:cs="Times New Roman"/>
-                <w:b/>
-                <w:bCs/>
-                <w:sz w:val="24"/>
-                <w:szCs w:val="24"/>
-              </w:rPr>
-            </w:pPr>
-            <w:r>
-              <w:rPr>
-                <w:rFonts w:ascii="Times New Roman" w:eastAsia="Times New Roman" w:hAnsi="Times New Roman" w:cs="Times New Roman"/>
-                <w:b/>
-                <w:bCs/>
+                <w:sz w:val="24"/>
+                <w:szCs w:val="24"/>
+              </w:rPr>
+            </w:pPr>
+            <w:r>
+              <w:rPr>
+                <w:rFonts w:ascii="Times New Roman" w:eastAsia="Times New Roman" w:hAnsi="Times New Roman" w:cs="Times New Roman"/>
                 <w:sz w:val="24"/>
                 <w:szCs w:val="24"/>
               </w:rPr>
@@ -3586,17 +3566,13 @@
               <w:jc w:val="center"/>
               <w:rPr>
                 <w:rFonts w:ascii="Times New Roman" w:eastAsia="Times New Roman" w:hAnsi="Times New Roman" w:cs="Times New Roman"/>
-                <w:b/>
-                <w:bCs/>
-                <w:sz w:val="24"/>
-                <w:szCs w:val="24"/>
-              </w:rPr>
-            </w:pPr>
-            <w:r>
-              <w:rPr>
-                <w:rFonts w:ascii="Times New Roman" w:eastAsia="Times New Roman" w:hAnsi="Times New Roman" w:cs="Times New Roman"/>
-                <w:b/>
-                <w:bCs/>
+                <w:sz w:val="24"/>
+                <w:szCs w:val="24"/>
+              </w:rPr>
+            </w:pPr>
+            <w:r>
+              <w:rPr>
+                <w:rFonts w:ascii="Times New Roman" w:eastAsia="Times New Roman" w:hAnsi="Times New Roman" w:cs="Times New Roman"/>
                 <w:sz w:val="24"/>
                 <w:szCs w:val="24"/>
               </w:rPr>
@@ -3614,17 +3590,13 @@
               <w:jc w:val="center"/>
               <w:rPr>
                 <w:rFonts w:ascii="Times New Roman" w:eastAsia="Times New Roman" w:hAnsi="Times New Roman" w:cs="Times New Roman"/>
-                <w:b/>
-                <w:bCs/>
-                <w:sz w:val="24"/>
-                <w:szCs w:val="24"/>
-              </w:rPr>
-            </w:pPr>
-            <w:r>
-              <w:rPr>
-                <w:rFonts w:ascii="Times New Roman" w:eastAsia="Times New Roman" w:hAnsi="Times New Roman" w:cs="Times New Roman"/>
-                <w:b/>
-                <w:bCs/>
+                <w:sz w:val="24"/>
+                <w:szCs w:val="24"/>
+              </w:rPr>
+            </w:pPr>
+            <w:r>
+              <w:rPr>
+                <w:rFonts w:ascii="Times New Roman" w:eastAsia="Times New Roman" w:hAnsi="Times New Roman" w:cs="Times New Roman"/>
                 <w:sz w:val="24"/>
                 <w:szCs w:val="24"/>
               </w:rPr>
@@ -3642,17 +3614,13 @@
               <w:jc w:val="center"/>
               <w:rPr>
                 <w:rFonts w:ascii="Times New Roman" w:eastAsia="Times New Roman" w:hAnsi="Times New Roman" w:cs="Times New Roman"/>
-                <w:b/>
-                <w:bCs/>
-                <w:sz w:val="24"/>
-                <w:szCs w:val="24"/>
-              </w:rPr>
-            </w:pPr>
-            <w:r>
-              <w:rPr>
-                <w:rFonts w:ascii="Times New Roman" w:eastAsia="Times New Roman" w:hAnsi="Times New Roman" w:cs="Times New Roman"/>
-                <w:b/>
-                <w:bCs/>
+                <w:sz w:val="24"/>
+                <w:szCs w:val="24"/>
+              </w:rPr>
+            </w:pPr>
+            <w:r>
+              <w:rPr>
+                <w:rFonts w:ascii="Times New Roman" w:eastAsia="Times New Roman" w:hAnsi="Times New Roman" w:cs="Times New Roman"/>
                 <w:sz w:val="24"/>
                 <w:szCs w:val="24"/>
               </w:rPr>
@@ -4781,17 +4749,13 @@
               <w:jc w:val="center"/>
               <w:rPr>
                 <w:rFonts w:ascii="Times New Roman" w:eastAsia="Times New Roman" w:hAnsi="Times New Roman" w:cs="Times New Roman"/>
-                <w:b/>
-                <w:bCs/>
-                <w:sz w:val="24"/>
-                <w:szCs w:val="24"/>
-              </w:rPr>
-            </w:pPr>
-            <w:r>
-              <w:rPr>
-                <w:rFonts w:ascii="Times New Roman" w:eastAsia="Times New Roman" w:hAnsi="Times New Roman" w:cs="Times New Roman"/>
-                <w:b/>
-                <w:bCs/>
+                <w:sz w:val="24"/>
+                <w:szCs w:val="24"/>
+              </w:rPr>
+            </w:pPr>
+            <w:r>
+              <w:rPr>
+                <w:rFonts w:ascii="Times New Roman" w:eastAsia="Times New Roman" w:hAnsi="Times New Roman" w:cs="Times New Roman"/>
                 <w:sz w:val="24"/>
                 <w:szCs w:val="24"/>
               </w:rPr>
@@ -4809,17 +4773,13 @@
               <w:jc w:val="center"/>
               <w:rPr>
                 <w:rFonts w:ascii="Times New Roman" w:eastAsia="Times New Roman" w:hAnsi="Times New Roman" w:cs="Times New Roman"/>
-                <w:b/>
-                <w:bCs/>
-                <w:sz w:val="24"/>
-                <w:szCs w:val="24"/>
-              </w:rPr>
-            </w:pPr>
-            <w:r>
-              <w:rPr>
-                <w:rFonts w:ascii="Times New Roman" w:eastAsia="Times New Roman" w:hAnsi="Times New Roman" w:cs="Times New Roman"/>
-                <w:b/>
-                <w:bCs/>
+                <w:sz w:val="24"/>
+                <w:szCs w:val="24"/>
+              </w:rPr>
+            </w:pPr>
+            <w:r>
+              <w:rPr>
+                <w:rFonts w:ascii="Times New Roman" w:eastAsia="Times New Roman" w:hAnsi="Times New Roman" w:cs="Times New Roman"/>
                 <w:sz w:val="24"/>
                 <w:szCs w:val="24"/>
               </w:rPr>
@@ -4837,17 +4797,13 @@
               <w:jc w:val="center"/>
               <w:rPr>
                 <w:rFonts w:ascii="Times New Roman" w:eastAsia="Times New Roman" w:hAnsi="Times New Roman" w:cs="Times New Roman"/>
-                <w:b/>
-                <w:bCs/>
-                <w:sz w:val="24"/>
-                <w:szCs w:val="24"/>
-              </w:rPr>
-            </w:pPr>
-            <w:r>
-              <w:rPr>
-                <w:rFonts w:ascii="Times New Roman" w:eastAsia="Times New Roman" w:hAnsi="Times New Roman" w:cs="Times New Roman"/>
-                <w:b/>
-                <w:bCs/>
+                <w:sz w:val="24"/>
+                <w:szCs w:val="24"/>
+              </w:rPr>
+            </w:pPr>
+            <w:r>
+              <w:rPr>
+                <w:rFonts w:ascii="Times New Roman" w:eastAsia="Times New Roman" w:hAnsi="Times New Roman" w:cs="Times New Roman"/>
                 <w:sz w:val="24"/>
                 <w:szCs w:val="24"/>
               </w:rPr>
@@ -4865,17 +4821,13 @@
               <w:jc w:val="center"/>
               <w:rPr>
                 <w:rFonts w:ascii="Times New Roman" w:eastAsia="Times New Roman" w:hAnsi="Times New Roman" w:cs="Times New Roman"/>
-                <w:b/>
-                <w:bCs/>
-                <w:sz w:val="24"/>
-                <w:szCs w:val="24"/>
-              </w:rPr>
-            </w:pPr>
-            <w:r>
-              <w:rPr>
-                <w:rFonts w:ascii="Times New Roman" w:eastAsia="Times New Roman" w:hAnsi="Times New Roman" w:cs="Times New Roman"/>
-                <w:b/>
-                <w:bCs/>
+                <w:sz w:val="24"/>
+                <w:szCs w:val="24"/>
+              </w:rPr>
+            </w:pPr>
+            <w:r>
+              <w:rPr>
+                <w:rFonts w:ascii="Times New Roman" w:eastAsia="Times New Roman" w:hAnsi="Times New Roman" w:cs="Times New Roman"/>
                 <w:sz w:val="24"/>
                 <w:szCs w:val="24"/>
               </w:rPr>

</xml_diff>